<commit_message>
Agrega SICMA-API 1.0 y openapi.yaml; corrige CU-20 en SICMA-CUS 1.1
Co-Authored-By: Claude Sonnet 5.5 <noreply@anthropic.com>
Claude-Session: https://claude.ai/code/session_01A5yFqx2DQWq2C9ytx8Wgdf
</commit_message>
<xml_diff>
--- a/Fase 2/Evidencias del Proyecto/SICMA_CUS_v1.1.docx
+++ b/Fase 2/Evidencias del Proyecto/SICMA_CUS_v1.1.docx
@@ -406,7 +406,7 @@
         <w:tab/>
       </w:r>
       <w:r>
-        <w:t>5</w:t>
+        <w:t>6</w:t>
       </w:r>
     </w:p>
     <w:p>
@@ -462,7 +462,7 @@
         <w:tab/>
       </w:r>
       <w:r>
-        <w:t>7</w:t>
+        <w:t>8</w:t>
       </w:r>
     </w:p>
     <w:p>
@@ -490,7 +490,7 @@
         <w:tab/>
       </w:r>
       <w:r>
-        <w:t>8</w:t>
+        <w:t>9</w:t>
       </w:r>
     </w:p>
     <w:p>
@@ -504,7 +504,7 @@
         <w:tab/>
       </w:r>
       <w:r>
-        <w:t>8</w:t>
+        <w:t>9</w:t>
       </w:r>
     </w:p>
     <w:p>
@@ -518,7 +518,7 @@
         <w:tab/>
       </w:r>
       <w:r>
-        <w:t>9</w:t>
+        <w:t>10</w:t>
       </w:r>
     </w:p>
     <w:p>
@@ -532,7 +532,7 @@
         <w:tab/>
       </w:r>
       <w:r>
-        <w:t>10</w:t>
+        <w:t>11</w:t>
       </w:r>
     </w:p>
     <w:p>
@@ -546,7 +546,7 @@
         <w:tab/>
       </w:r>
       <w:r>
-        <w:t>11</w:t>
+        <w:t>12</w:t>
       </w:r>
     </w:p>
     <w:p>
@@ -602,7 +602,7 @@
         <w:tab/>
       </w:r>
       <w:r>
-        <w:t>14</w:t>
+        <w:t>15</w:t>
       </w:r>
     </w:p>
     <w:p>
@@ -1397,7 +1397,7 @@
               <w:rPr>
                 <w:sz w:val="18"/>
               </w:rPr>
-              <w:t>Se alinean los casos de uso con el código del 25 de octubre (commit 59710a5d): lector SecuGen con agente (cierra D-03), comunicación con Power Automate por correo (cierra D-02), rol Contratistas y Administrador Privilegiado, personal externo con verificación de huella, estados de la intervención y gestión de alertas. Se redibuja el diagrama del módulo 5.</w:t>
+              <w:t>Se alinean los casos de uso con el código del 25 de octubre (commit 59710a5d): lector SecuGen con agente (cierra D-03), comunicación con Power Automate por correo (cierra D-02), rol Contratistas y Administrador Privilegiado, personal externo con verificación de huella, estados de la intervención y gestión de alertas. Se redibuja el diagrama del módulo 5. Corrección del mismo día: CU-20 ya no menciona "cambios solicitados", porque el código no tiene ningún flujo que asigne ese estado.</w:t>
             </w:r>
           </w:p>
         </w:tc>
@@ -5245,7 +5245,7 @@
         <w:pStyle w:val="Compact"/>
       </w:pPr>
       <w:r>
-        <w:t>Resultado: solicitud Aprobada o Rechazada, o con cambios solicitados. Una intervención aprobada no cambia activos, horario ni impacto; si hay cambios vuelve a Pendiente. El Administrador o la Jefatura pueden cancelar una intervención Pendiente o Aprobada.</w:t>
+        <w:t>Resultado: solicitud Aprobada o Rechazada. Una intervención aprobada no cambia activos, horario ni impacto. El Administrador o la Jefatura pueden cancelar una intervención Pendiente o Aprobada.</w:t>
       </w:r>
     </w:p>
     <w:p>

</xml_diff>